<commit_message>
docs: add system design diagrams and technology selection documentation
</commit_message>
<xml_diff>
--- a/DOCUMENT/Lua Chon Cong Nghe OmniGo.docx
+++ b/DOCUMENT/Lua Chon Cong Nghe OmniGo.docx
@@ -364,7 +364,7 @@
                 <w:sz w:val="26"/>
                 <w:szCs w:val="26"/>
               </w:rPr>
-              <w:t>Apache Kafka, RabbitMQ</w:t>
+              <w:t>Apache Kafka</w:t>
             </w:r>
           </w:p>
         </w:tc>
@@ -761,7 +761,25 @@
                 <w:sz w:val="26"/>
                 <w:szCs w:val="26"/>
               </w:rPr>
-              <w:t>React.js, TypeScript, Tailwind CSS, Redux Toolkit</w:t>
+              <w:t xml:space="preserve">React.js, </w:t>
+            </w:r>
+            <w:r>
+              <w:rPr>
+                <w:rFonts w:ascii="Times New Roman" w:hAnsi="Times New Roman" w:cs="Times New Roman"/>
+                <w:color w:val="222222"/>
+                <w:sz w:val="26"/>
+                <w:szCs w:val="26"/>
+              </w:rPr>
+              <w:t>JavaScript</w:t>
+            </w:r>
+            <w:r>
+              <w:rPr>
+                <w:rFonts w:ascii="Times New Roman" w:hAnsi="Times New Roman" w:cs="Times New Roman"/>
+                <w:color w:val="222222"/>
+                <w:sz w:val="26"/>
+                <w:szCs w:val="26"/>
+              </w:rPr>
+              <w:t>, Tailwind CSS, Redux Toolkit</w:t>
             </w:r>
           </w:p>
         </w:tc>
@@ -3181,6 +3199,7 @@
       <w:r>
         <w:rPr>
           <w:rFonts w:ascii="Times New Roman" w:hAnsi="Times New Roman" w:cs="Times New Roman"/>
+          <w:noProof/>
           <w:sz w:val="26"/>
           <w:szCs w:val="26"/>
         </w:rPr>
@@ -3336,6 +3355,7 @@
       <w:r>
         <w:rPr>
           <w:rFonts w:ascii="Times New Roman" w:hAnsi="Times New Roman" w:cs="Times New Roman"/>
+          <w:noProof/>
           <w:sz w:val="26"/>
           <w:szCs w:val="26"/>
         </w:rPr>
@@ -3489,6 +3509,7 @@
       <w:r>
         <w:rPr>
           <w:rFonts w:ascii="Times New Roman" w:hAnsi="Times New Roman" w:cs="Times New Roman"/>
+          <w:noProof/>
           <w:sz w:val="26"/>
           <w:szCs w:val="26"/>
         </w:rPr>

</xml_diff>

<commit_message>
docs: add system design diagrams and technology selection documentation (#1)
</commit_message>
<xml_diff>
--- a/DOCUMENT/Lua Chon Cong Nghe OmniGo.docx
+++ b/DOCUMENT/Lua Chon Cong Nghe OmniGo.docx
@@ -364,7 +364,7 @@
                 <w:sz w:val="26"/>
                 <w:szCs w:val="26"/>
               </w:rPr>
-              <w:t>Apache Kafka, RabbitMQ</w:t>
+              <w:t>Apache Kafka</w:t>
             </w:r>
           </w:p>
         </w:tc>
@@ -761,7 +761,25 @@
                 <w:sz w:val="26"/>
                 <w:szCs w:val="26"/>
               </w:rPr>
-              <w:t>React.js, TypeScript, Tailwind CSS, Redux Toolkit</w:t>
+              <w:t xml:space="preserve">React.js, </w:t>
+            </w:r>
+            <w:r>
+              <w:rPr>
+                <w:rFonts w:ascii="Times New Roman" w:hAnsi="Times New Roman" w:cs="Times New Roman"/>
+                <w:color w:val="222222"/>
+                <w:sz w:val="26"/>
+                <w:szCs w:val="26"/>
+              </w:rPr>
+              <w:t>JavaScript</w:t>
+            </w:r>
+            <w:r>
+              <w:rPr>
+                <w:rFonts w:ascii="Times New Roman" w:hAnsi="Times New Roman" w:cs="Times New Roman"/>
+                <w:color w:val="222222"/>
+                <w:sz w:val="26"/>
+                <w:szCs w:val="26"/>
+              </w:rPr>
+              <w:t>, Tailwind CSS, Redux Toolkit</w:t>
             </w:r>
           </w:p>
         </w:tc>
@@ -3181,6 +3199,7 @@
       <w:r>
         <w:rPr>
           <w:rFonts w:ascii="Times New Roman" w:hAnsi="Times New Roman" w:cs="Times New Roman"/>
+          <w:noProof/>
           <w:sz w:val="26"/>
           <w:szCs w:val="26"/>
         </w:rPr>
@@ -3336,6 +3355,7 @@
       <w:r>
         <w:rPr>
           <w:rFonts w:ascii="Times New Roman" w:hAnsi="Times New Roman" w:cs="Times New Roman"/>
+          <w:noProof/>
           <w:sz w:val="26"/>
           <w:szCs w:val="26"/>
         </w:rPr>
@@ -3489,6 +3509,7 @@
       <w:r>
         <w:rPr>
           <w:rFonts w:ascii="Times New Roman" w:hAnsi="Times New Roman" w:cs="Times New Roman"/>
+          <w:noProof/>
           <w:sz w:val="26"/>
           <w:szCs w:val="26"/>
         </w:rPr>

</xml_diff>